<commit_message>
Deployed abc8cdb1 with MkDocs version: 1.6.1
</commit_message>
<xml_diff>
--- a/download/accounting_point_grid_location.docx
+++ b/download/accounting_point_grid_location.docx
@@ -163,10 +163,10 @@
         <w:tblLook w:firstRow="1" w:lastRow="0" w:firstColumn="0" w:lastColumn="0" w:noHBand="0" w:noVBand="0" w:val="0020"/>
       </w:tblPr>
       <w:tblGrid>
-        <w:gridCol w:w="1814"/>
-        <w:gridCol w:w="3454"/>
-        <w:gridCol w:w="1727"/>
-        <w:gridCol w:w="924"/>
+        <w:gridCol w:w="1763"/>
+        <w:gridCol w:w="3357"/>
+        <w:gridCol w:w="1899"/>
+        <w:gridCol w:w="898"/>
       </w:tblGrid>
       <w:tr>
         <w:trPr>
@@ -365,18 +365,6 @@
               <w:t xml:space="preserve">substation</w:t>
             </w:r>
             <w:r>
-              <w:t xml:space="preserve">,</w:t>
-            </w:r>
-            <w:r>
-              <w:t xml:space="preserve"> </w:t>
-            </w:r>
-            <w:r>
-              <w:rPr>
-                <w:rStyle w:val="VerbatimChar"/>
-              </w:rPr>
-              <w:t xml:space="preserve">transformer</w:t>
-            </w:r>
-            <w:r>
               <w:t xml:space="preserve">Required</w:t>
             </w:r>
           </w:p>
@@ -433,6 +421,9 @@
                 <w:rStyle w:val="VerbatimChar"/>
               </w:rPr>
               <w:t xml:space="preserve">^[0-9a-fA-F]{8}-[0-9a-fA-F]{4}-[0-9a-fA-F]{4}-[0-9a-fA-F]{4}-[0-9a-fA-F]{12}$</w:t>
+            </w:r>
+            <w:r>
+              <w:t xml:space="preserve">Required</w:t>
             </w:r>
           </w:p>
         </w:tc>
@@ -1108,6 +1099,56 @@
             </w:r>
             <w:r>
               <w:t xml:space="preserve">.</w:t>
+            </w:r>
+          </w:p>
+        </w:tc>
+        <w:tc>
+          <w:tcPr/>
+          <w:p>
+            <w:pPr>
+              <w:pStyle w:val="Compact"/>
+            </w:pPr>
+            <w:r>
+              <w:t xml:space="preserve">DONE</w:t>
+            </w:r>
+          </w:p>
+        </w:tc>
+      </w:tr>
+      <w:tr>
+        <w:tc>
+          <w:tcPr/>
+          <w:p>
+            <w:pPr>
+              <w:pStyle w:val="Compact"/>
+            </w:pPr>
+            <w:r>
+              <w:t xml:space="preserve">APGL-VAL003</w:t>
+            </w:r>
+          </w:p>
+        </w:tc>
+        <w:tc>
+          <w:tcPr/>
+          <w:p>
+            <w:pPr>
+              <w:pStyle w:val="Compact"/>
+            </w:pPr>
+            <w:r>
+              <w:t xml:space="preserve">A grid location can only be</w:t>
+            </w:r>
+            <w:r>
+              <w:t xml:space="preserve"> </w:t>
+            </w:r>
+            <w:r>
+              <w:rPr>
+                <w:rStyle w:val="VerbatimChar"/>
+              </w:rPr>
+              <w:t xml:space="preserve">confirmed</w:t>
+            </w:r>
+            <w:r>
+              <w:t xml:space="preserve"> </w:t>
+            </w:r>
+            <w:r>
+              <w:t xml:space="preserve">with a non-zero voltage level.</w:t>
             </w:r>
           </w:p>
         </w:tc>

</xml_diff>

<commit_message>
Deployed a6ff497b with MkDocs version: 1.6.1
</commit_message>
<xml_diff>
--- a/download/accounting_point_grid_location.docx
+++ b/download/accounting_point_grid_location.docx
@@ -762,7 +762,7 @@
               <w:pStyle w:val="Compact"/>
             </w:pPr>
             <w:r>
-              <w:t xml:space="preserve">The quality of the grid location registration.</w:t>
+              <w:t xml:space="preserve">Indicates how the grid location was determined. Guessed means that Flexibility Information System has estimated the location, while confirmed means that someone has verified it.</w:t>
             </w:r>
           </w:p>
         </w:tc>
@@ -1148,7 +1148,19 @@
               <w:t xml:space="preserve"> </w:t>
             </w:r>
             <w:r>
-              <w:t xml:space="preserve">with a non-zero voltage level.</w:t>
+              <w:t xml:space="preserve">with a non-zero voltage level, unless the source is the</w:t>
+            </w:r>
+            <w:r>
+              <w:t xml:space="preserve"> </w:t>
+            </w:r>
+            <w:r>
+              <w:rPr>
+                <w:rStyle w:val="VerbatimChar"/>
+              </w:rPr>
+              <w:t xml:space="preserve">grid_model</w:t>
+            </w:r>
+            <w:r>
+              <w:t xml:space="preserve">.</w:t>
             </w:r>
           </w:p>
         </w:tc>
@@ -1236,15 +1248,16 @@
     <w:tbl>
       <w:tblPr>
         <w:tblStyle w:val="Table"/>
-        <w:tblW w:type="auto" w:w="0"/>
+        <w:tblW w:type="pct" w:w="5000"/>
+        <w:tblLayout w:type="fixed"/>
         <w:tblLook w:firstRow="1" w:lastRow="0" w:firstColumn="0" w:lastColumn="0" w:noHBand="0" w:noVBand="0" w:val="0020"/>
       </w:tblPr>
       <w:tblGrid>
+        <w:gridCol w:w="2149"/>
         <w:gridCol w:w="1584"/>
-        <w:gridCol w:w="1584"/>
-        <w:gridCol w:w="1584"/>
-        <w:gridCol w:w="1584"/>
-        <w:gridCol w:w="1584"/>
+        <w:gridCol w:w="2376"/>
+        <w:gridCol w:w="678"/>
+        <w:gridCol w:w="1131"/>
       </w:tblGrid>
       <w:tr>
         <w:trPr>
@@ -1351,7 +1364,7 @@
               <w:pStyle w:val="Compact"/>
             </w:pPr>
             <w:r>
-              <w:t xml:space="preserve">no</w:t>
+              <w:t xml:space="preserve">yes (voltage level)</w:t>
             </w:r>
           </w:p>
         </w:tc>

</xml_diff>